<commit_message>
Add AI use statement to manuscript
</commit_message>
<xml_diff>
--- a/submission/nature_communications/SpatialLeak_NatCommun_V9_language_polished.docx
+++ b/submission/nature_communications/SpatialLeak_NatCommun_V9_language_polished.docx
@@ -634,6 +634,19 @@
         <w:pStyle w:val="Heading1"/>
       </w:pPr>
       <w:r>
+        <w:t>AI Use Statement</w:t>
+      </w:r>
+    </w:p>
+    <w:p>
+      <w:r>
+        <w:t>ChatGPT was used to assist with code-related work, language polishing and manuscript formatting. The authors reviewed and approved the final manuscript content and take full responsibility for the work.</w:t>
+      </w:r>
+    </w:p>
+    <w:p>
+      <w:pPr>
+        <w:pStyle w:val="Heading1"/>
+      </w:pPr>
+      <w:r>
         <w:t>References</w:t>
       </w:r>
     </w:p>

</xml_diff>